<commit_message>
Added examples of tables to docs
</commit_message>
<xml_diff>
--- a/docs/ТПО ЛР №3 Силинцев ВВ.docx
+++ b/docs/ТПО ЛР №3 Силинцев ВВ.docx
@@ -706,14 +706,54 @@
             </w:tabs>
             <w:rPr/>
           </w:pPr>
-          <w:hyperlink w:anchor="__RefHeading___Toc524_1614521587_%25D0%1" w:tooltip="Выводы">
+          <w:hyperlink w:anchor="__RefHeading___Toc524_1614521587_%25D0%1" w:tooltip="Тестовые сценарии">
+            <w:r>
+              <w:rPr>
+                <w:rStyle w:val="Style11"/>
+              </w:rPr>
+              <w:t>Тестовые сценарии</w:t>
+              <w:tab/>
+              <w:t>8</w:t>
+            </w:r>
+          </w:hyperlink>
+        </w:p>
+        <w:p>
+          <w:pPr>
+            <w:pStyle w:val="TOC1"/>
+            <w:tabs>
+              <w:tab w:val="clear" w:pos="708"/>
+              <w:tab w:val="right" w:pos="9354" w:leader="dot"/>
+            </w:tabs>
+            <w:rPr/>
+          </w:pPr>
+          <w:hyperlink w:anchor="__RefHeading___Toc524_1614521587_%25D0%3" w:tooltip="Чек-лист">
+            <w:r>
+              <w:rPr>
+                <w:rStyle w:val="Style11"/>
+              </w:rPr>
+              <w:t>Чек-лист</w:t>
+              <w:tab/>
+              <w:t>9</w:t>
+            </w:r>
+          </w:hyperlink>
+        </w:p>
+        <w:p>
+          <w:pPr>
+            <w:pStyle w:val="TOC1"/>
+            <w:tabs>
+              <w:tab w:val="clear" w:pos="708"/>
+              <w:tab w:val="right" w:pos="9354" w:leader="dot"/>
+            </w:tabs>
+            <w:rPr/>
+          </w:pPr>
+          <w:hyperlink w:anchor="__RefHeading___Toc524_1614521587_%25D0%4" w:tooltip="Выводы">
             <w:r>
               <w:rPr>
                 <w:rStyle w:val="Style11"/>
               </w:rPr>
               <w:t>Выводы</w:t>
               <w:tab/>
-              <w:t>8</w:t>
+              <w:t>10</w:t>
             </w:r>
           </w:hyperlink>
           <w:r>
@@ -1312,6 +1352,509 @@
         <w:t>Прецеденты использования</w:t>
       </w:r>
     </w:p>
+    <w:tbl>
+      <w:tblPr>
+        <w:tblW w:w="5000" w:type="pct"/>
+        <w:jc w:val="left"/>
+        <w:tblInd w:w="55" w:type="dxa"/>
+        <w:tblLayout w:type="fixed"/>
+        <w:tblCellMar>
+          <w:top w:w="55" w:type="dxa"/>
+          <w:left w:w="55" w:type="dxa"/>
+          <w:bottom w:w="55" w:type="dxa"/>
+          <w:right w:w="55" w:type="dxa"/>
+        </w:tblCellMar>
+      </w:tblPr>
+      <w:tblGrid>
+        <w:gridCol w:w="3512"/>
+        <w:gridCol w:w="5843"/>
+      </w:tblGrid>
+      <w:tr>
+        <w:trPr/>
+        <w:tc>
+          <w:tcPr>
+            <w:tcW w:w="3512" w:type="dxa"/>
+            <w:tcBorders>
+              <w:top w:val="single" w:sz="4" w:space="0" w:color="000000"/>
+              <w:left w:val="single" w:sz="4" w:space="0" w:color="000000"/>
+              <w:bottom w:val="single" w:sz="4" w:space="0" w:color="000000"/>
+            </w:tcBorders>
+            <w:vAlign w:val="center"/>
+          </w:tcPr>
+          <w:p>
+            <w:pPr>
+              <w:pStyle w:val="Style24"/>
+              <w:spacing w:before="0" w:after="160"/>
+              <w:jc w:val="center"/>
+              <w:rPr>
+                <w:b/>
+                <w:bCs/>
+              </w:rPr>
+            </w:pPr>
+            <w:r>
+              <w:rPr>
+                <w:b/>
+                <w:bCs/>
+              </w:rPr>
+              <w:t>Прецедент</w:t>
+            </w:r>
+          </w:p>
+        </w:tc>
+        <w:tc>
+          <w:tcPr>
+            <w:tcW w:w="5843" w:type="dxa"/>
+            <w:tcBorders>
+              <w:top w:val="single" w:sz="4" w:space="0" w:color="000000"/>
+              <w:bottom w:val="single" w:sz="4" w:space="0" w:color="000000"/>
+              <w:right w:val="single" w:sz="4" w:space="0" w:color="000000"/>
+            </w:tcBorders>
+            <w:vAlign w:val="center"/>
+          </w:tcPr>
+          <w:p>
+            <w:pPr>
+              <w:pStyle w:val="Style24"/>
+              <w:spacing w:before="0" w:after="160"/>
+              <w:jc w:val="center"/>
+              <w:rPr>
+                <w:b/>
+                <w:bCs/>
+                <w:lang w:val="ru-RU"/>
+              </w:rPr>
+            </w:pPr>
+            <w:r>
+              <w:rPr>
+                <w:b/>
+                <w:bCs/>
+                <w:lang w:val="ru-RU"/>
+              </w:rPr>
+              <w:t>Вход</w:t>
+            </w:r>
+          </w:p>
+        </w:tc>
+      </w:tr>
+      <w:tr>
+        <w:trPr/>
+        <w:tc>
+          <w:tcPr>
+            <w:tcW w:w="3512" w:type="dxa"/>
+            <w:tcBorders>
+              <w:left w:val="single" w:sz="4" w:space="0" w:color="000000"/>
+              <w:bottom w:val="single" w:sz="4" w:space="0" w:color="000000"/>
+            </w:tcBorders>
+            <w:vAlign w:val="center"/>
+          </w:tcPr>
+          <w:p>
+            <w:pPr>
+              <w:pStyle w:val="Style24"/>
+              <w:spacing w:before="0" w:after="160"/>
+              <w:jc w:val="both"/>
+              <w:rPr>
+                <w:b w:val="false"/>
+                <w:bCs w:val="false"/>
+              </w:rPr>
+            </w:pPr>
+            <w:r>
+              <w:rPr>
+                <w:b w:val="false"/>
+                <w:bCs w:val="false"/>
+              </w:rPr>
+              <w:t>ID</w:t>
+            </w:r>
+          </w:p>
+        </w:tc>
+        <w:tc>
+          <w:tcPr>
+            <w:tcW w:w="5843" w:type="dxa"/>
+            <w:tcBorders>
+              <w:bottom w:val="single" w:sz="4" w:space="0" w:color="000000"/>
+              <w:right w:val="single" w:sz="4" w:space="0" w:color="000000"/>
+            </w:tcBorders>
+            <w:vAlign w:val="center"/>
+          </w:tcPr>
+          <w:p>
+            <w:pPr>
+              <w:pStyle w:val="Style24"/>
+              <w:spacing w:before="0" w:after="160"/>
+              <w:jc w:val="both"/>
+              <w:rPr>
+                <w:b w:val="false"/>
+                <w:bCs w:val="false"/>
+              </w:rPr>
+            </w:pPr>
+            <w:r>
+              <w:rPr>
+                <w:b w:val="false"/>
+                <w:bCs w:val="false"/>
+                <w:lang w:val="ru-RU"/>
+              </w:rPr>
+              <w:t>1</w:t>
+            </w:r>
+          </w:p>
+        </w:tc>
+      </w:tr>
+      <w:tr>
+        <w:trPr/>
+        <w:tc>
+          <w:tcPr>
+            <w:tcW w:w="3512" w:type="dxa"/>
+            <w:tcBorders>
+              <w:left w:val="single" w:sz="4" w:space="0" w:color="000000"/>
+              <w:bottom w:val="single" w:sz="4" w:space="0" w:color="000000"/>
+            </w:tcBorders>
+            <w:vAlign w:val="center"/>
+          </w:tcPr>
+          <w:p>
+            <w:pPr>
+              <w:pStyle w:val="Style24"/>
+              <w:spacing w:before="0" w:after="160"/>
+              <w:jc w:val="both"/>
+              <w:rPr>
+                <w:b w:val="false"/>
+                <w:bCs w:val="false"/>
+              </w:rPr>
+            </w:pPr>
+            <w:r>
+              <w:rPr>
+                <w:b w:val="false"/>
+                <w:bCs w:val="false"/>
+                <w:lang w:val="ru-RU"/>
+              </w:rPr>
+              <w:t>Краткое описание</w:t>
+            </w:r>
+          </w:p>
+        </w:tc>
+        <w:tc>
+          <w:tcPr>
+            <w:tcW w:w="5843" w:type="dxa"/>
+            <w:tcBorders>
+              <w:bottom w:val="single" w:sz="4" w:space="0" w:color="000000"/>
+              <w:right w:val="single" w:sz="4" w:space="0" w:color="000000"/>
+            </w:tcBorders>
+            <w:vAlign w:val="center"/>
+          </w:tcPr>
+          <w:p>
+            <w:pPr>
+              <w:pStyle w:val="Style24"/>
+              <w:spacing w:before="0" w:after="160"/>
+              <w:jc w:val="both"/>
+              <w:rPr>
+                <w:b w:val="false"/>
+                <w:bCs w:val="false"/>
+              </w:rPr>
+            </w:pPr>
+            <w:r>
+              <w:rPr>
+                <w:b w:val="false"/>
+                <w:bCs w:val="false"/>
+              </w:rPr>
+              <w:t>Пользователь входит в аккаунт</w:t>
+            </w:r>
+          </w:p>
+        </w:tc>
+      </w:tr>
+      <w:tr>
+        <w:trPr/>
+        <w:tc>
+          <w:tcPr>
+            <w:tcW w:w="3512" w:type="dxa"/>
+            <w:tcBorders>
+              <w:left w:val="single" w:sz="4" w:space="0" w:color="000000"/>
+              <w:bottom w:val="single" w:sz="4" w:space="0" w:color="000000"/>
+            </w:tcBorders>
+            <w:vAlign w:val="center"/>
+          </w:tcPr>
+          <w:p>
+            <w:pPr>
+              <w:pStyle w:val="Style24"/>
+              <w:spacing w:before="0" w:after="160"/>
+              <w:jc w:val="both"/>
+              <w:rPr>
+                <w:b w:val="false"/>
+                <w:bCs w:val="false"/>
+              </w:rPr>
+            </w:pPr>
+            <w:r>
+              <w:rPr>
+                <w:b w:val="false"/>
+                <w:bCs w:val="false"/>
+              </w:rPr>
+              <w:t>Главные актеры</w:t>
+            </w:r>
+          </w:p>
+        </w:tc>
+        <w:tc>
+          <w:tcPr>
+            <w:tcW w:w="5843" w:type="dxa"/>
+            <w:tcBorders>
+              <w:bottom w:val="single" w:sz="4" w:space="0" w:color="000000"/>
+              <w:right w:val="single" w:sz="4" w:space="0" w:color="000000"/>
+            </w:tcBorders>
+            <w:vAlign w:val="center"/>
+          </w:tcPr>
+          <w:p>
+            <w:pPr>
+              <w:pStyle w:val="Style24"/>
+              <w:spacing w:before="0" w:after="160"/>
+              <w:jc w:val="both"/>
+              <w:rPr>
+                <w:b w:val="false"/>
+                <w:bCs w:val="false"/>
+              </w:rPr>
+            </w:pPr>
+            <w:r>
+              <w:rPr>
+                <w:b w:val="false"/>
+                <w:bCs w:val="false"/>
+              </w:rPr>
+              <w:t>Не авторизованный пользователь</w:t>
+            </w:r>
+          </w:p>
+        </w:tc>
+      </w:tr>
+      <w:tr>
+        <w:trPr/>
+        <w:tc>
+          <w:tcPr>
+            <w:tcW w:w="3512" w:type="dxa"/>
+            <w:tcBorders>
+              <w:left w:val="single" w:sz="4" w:space="0" w:color="000000"/>
+              <w:bottom w:val="single" w:sz="4" w:space="0" w:color="000000"/>
+            </w:tcBorders>
+            <w:vAlign w:val="center"/>
+          </w:tcPr>
+          <w:p>
+            <w:pPr>
+              <w:pStyle w:val="Style24"/>
+              <w:spacing w:before="0" w:after="160"/>
+              <w:jc w:val="both"/>
+              <w:rPr>
+                <w:b w:val="false"/>
+                <w:bCs w:val="false"/>
+              </w:rPr>
+            </w:pPr>
+            <w:r>
+              <w:rPr>
+                <w:b w:val="false"/>
+                <w:bCs w:val="false"/>
+              </w:rPr>
+              <w:t>Второстепенные актеры</w:t>
+            </w:r>
+          </w:p>
+        </w:tc>
+        <w:tc>
+          <w:tcPr>
+            <w:tcW w:w="5843" w:type="dxa"/>
+            <w:tcBorders>
+              <w:bottom w:val="single" w:sz="4" w:space="0" w:color="000000"/>
+              <w:right w:val="single" w:sz="4" w:space="0" w:color="000000"/>
+            </w:tcBorders>
+            <w:vAlign w:val="center"/>
+          </w:tcPr>
+          <w:p>
+            <w:pPr>
+              <w:pStyle w:val="Style24"/>
+              <w:spacing w:before="0" w:after="160"/>
+              <w:jc w:val="both"/>
+              <w:rPr>
+                <w:b w:val="false"/>
+                <w:bCs w:val="false"/>
+              </w:rPr>
+            </w:pPr>
+            <w:r>
+              <w:rPr>
+                <w:b w:val="false"/>
+                <w:bCs w:val="false"/>
+                <w:lang w:val="ru-RU"/>
+              </w:rPr>
+              <w:t>Нет</w:t>
+            </w:r>
+          </w:p>
+        </w:tc>
+      </w:tr>
+      <w:tr>
+        <w:trPr/>
+        <w:tc>
+          <w:tcPr>
+            <w:tcW w:w="3512" w:type="dxa"/>
+            <w:tcBorders>
+              <w:left w:val="single" w:sz="4" w:space="0" w:color="000000"/>
+              <w:bottom w:val="single" w:sz="4" w:space="0" w:color="000000"/>
+            </w:tcBorders>
+            <w:vAlign w:val="center"/>
+          </w:tcPr>
+          <w:p>
+            <w:pPr>
+              <w:pStyle w:val="Style24"/>
+              <w:spacing w:before="0" w:after="160"/>
+              <w:jc w:val="both"/>
+              <w:rPr>
+                <w:b w:val="false"/>
+                <w:bCs w:val="false"/>
+              </w:rPr>
+            </w:pPr>
+            <w:r>
+              <w:rPr>
+                <w:b w:val="false"/>
+                <w:bCs w:val="false"/>
+              </w:rPr>
+              <w:t>Предусловия</w:t>
+            </w:r>
+          </w:p>
+        </w:tc>
+        <w:tc>
+          <w:tcPr>
+            <w:tcW w:w="5843" w:type="dxa"/>
+            <w:tcBorders>
+              <w:bottom w:val="single" w:sz="4" w:space="0" w:color="000000"/>
+              <w:right w:val="single" w:sz="4" w:space="0" w:color="000000"/>
+            </w:tcBorders>
+            <w:vAlign w:val="center"/>
+          </w:tcPr>
+          <w:p>
+            <w:pPr>
+              <w:pStyle w:val="Style24"/>
+              <w:spacing w:before="0" w:after="160"/>
+              <w:jc w:val="both"/>
+              <w:rPr>
+                <w:b w:val="false"/>
+                <w:bCs w:val="false"/>
+              </w:rPr>
+            </w:pPr>
+            <w:r>
+              <w:rPr>
+                <w:b w:val="false"/>
+                <w:bCs w:val="false"/>
+              </w:rPr>
+              <w:t xml:space="preserve">Пользователь </w:t>
+            </w:r>
+            <w:r>
+              <w:rPr>
+                <w:b w:val="false"/>
+                <w:bCs w:val="false"/>
+              </w:rPr>
+              <w:t>существует в системе</w:t>
+            </w:r>
+          </w:p>
+        </w:tc>
+      </w:tr>
+      <w:tr>
+        <w:trPr/>
+        <w:tc>
+          <w:tcPr>
+            <w:tcW w:w="3512" w:type="dxa"/>
+            <w:tcBorders>
+              <w:left w:val="single" w:sz="4" w:space="0" w:color="000000"/>
+              <w:bottom w:val="single" w:sz="4" w:space="0" w:color="000000"/>
+            </w:tcBorders>
+            <w:vAlign w:val="center"/>
+          </w:tcPr>
+          <w:p>
+            <w:pPr>
+              <w:pStyle w:val="Style24"/>
+              <w:spacing w:before="0" w:after="160"/>
+              <w:jc w:val="both"/>
+              <w:rPr>
+                <w:b w:val="false"/>
+                <w:bCs w:val="false"/>
+              </w:rPr>
+            </w:pPr>
+            <w:r>
+              <w:rPr>
+                <w:b w:val="false"/>
+                <w:bCs w:val="false"/>
+              </w:rPr>
+              <w:t>Основной поток</w:t>
+            </w:r>
+          </w:p>
+        </w:tc>
+        <w:tc>
+          <w:tcPr>
+            <w:tcW w:w="5843" w:type="dxa"/>
+            <w:tcBorders>
+              <w:bottom w:val="single" w:sz="4" w:space="0" w:color="000000"/>
+              <w:right w:val="single" w:sz="4" w:space="0" w:color="000000"/>
+            </w:tcBorders>
+            <w:vAlign w:val="center"/>
+          </w:tcPr>
+          <w:p>
+            <w:pPr>
+              <w:pStyle w:val="Style24"/>
+              <w:rPr/>
+            </w:pPr>
+            <w:r>
+              <w:rPr/>
+              <w:t xml:space="preserve">1. </w:t>
+            </w:r>
+            <w:r>
+              <w:rPr/>
+              <w:t>Пользователь переходит на главную страницу</w:t>
+            </w:r>
+          </w:p>
+          <w:p>
+            <w:pPr>
+              <w:pStyle w:val="Style24"/>
+              <w:rPr/>
+            </w:pPr>
+            <w:r>
+              <w:rPr/>
+              <w:t xml:space="preserve">2. </w:t>
+            </w:r>
+            <w:r>
+              <w:rPr/>
+              <w:t>Пользователь выбирает «Войти»</w:t>
+            </w:r>
+          </w:p>
+          <w:p>
+            <w:pPr>
+              <w:pStyle w:val="Style24"/>
+              <w:rPr/>
+            </w:pPr>
+            <w:r>
+              <w:rPr/>
+              <w:t>3. Пользователь перенаправляется на страницу авторизации</w:t>
+            </w:r>
+          </w:p>
+          <w:p>
+            <w:pPr>
+              <w:pStyle w:val="Style24"/>
+              <w:rPr/>
+            </w:pPr>
+            <w:r>
+              <w:rPr/>
+              <w:t xml:space="preserve">4. </w:t>
+            </w:r>
+            <w:r>
+              <w:rPr/>
+              <w:t xml:space="preserve">Пользователь </w:t>
+            </w:r>
+            <w:r>
+              <w:rPr/>
+              <w:t>выбирает способ входа, вводит данные и подтверждает отправку.</w:t>
+            </w:r>
+          </w:p>
+          <w:p>
+            <w:pPr>
+              <w:pStyle w:val="Style24"/>
+              <w:rPr/>
+            </w:pPr>
+            <w:r>
+              <w:rPr/>
+              <w:t xml:space="preserve">5. Пользователь перенаправляется. </w:t>
+            </w:r>
+          </w:p>
+          <w:p>
+            <w:pPr>
+              <w:pStyle w:val="Style24"/>
+              <w:spacing w:before="0" w:after="160"/>
+              <w:rPr/>
+            </w:pPr>
+            <w:r>
+              <w:rPr/>
+            </w:r>
+          </w:p>
+        </w:tc>
+      </w:tr>
+    </w:tbl>
     <w:p>
       <w:pPr>
         <w:pStyle w:val="Normal"/>
@@ -1327,7 +1870,6 @@
         <w:rPr>
           <w:lang w:val="ru-RU"/>
         </w:rPr>
-        <w:t>Текст.</w:t>
       </w:r>
       <w:r>
         <w:br w:type="page"/>
@@ -1340,11 +1882,10 @@
         <w:ind w:left="709"/>
         <w:jc w:val="center"/>
         <w:rPr>
-          <w:rFonts w:ascii="Times New Roman" w:hAnsi="Times New Roman"/>
+          <w:lang w:val="ru-RU"/>
         </w:rPr>
       </w:pPr>
       <w:bookmarkStart w:id="4" w:name="__RefHeading___Toc524_1614521587_Копия_2"/>
-      <w:bookmarkStart w:id="5" w:name="_Toc146616696_Копия_1_Копия_1"/>
       <w:bookmarkEnd w:id="4"/>
       <w:r>
         <w:rPr>
@@ -1352,10 +1893,1140 @@
           <w:b/>
           <w:bCs/>
           <w:color w:val="auto"/>
+          <w:lang w:val="ru-RU"/>
+        </w:rPr>
+        <w:t>Тестовые сценарии</w:t>
+      </w:r>
+    </w:p>
+    <w:p>
+      <w:pPr>
+        <w:pStyle w:val="Normal"/>
+        <w:bidi w:val="0"/>
+        <w:spacing w:lineRule="auto" w:line="360" w:beforeAutospacing="0" w:before="0" w:afterAutospacing="0" w:after="160"/>
+        <w:ind w:firstLine="709" w:left="0" w:right="0"/>
+        <w:jc w:val="both"/>
+        <w:rPr>
+          <w:lang w:val="ru-RU"/>
+        </w:rPr>
+      </w:pPr>
+      <w:r>
+        <w:rPr>
+          <w:lang w:val="ru-RU"/>
+        </w:rPr>
+        <w:t>Переход на главную страницу</w:t>
+      </w:r>
+      <w:r>
+        <w:rPr/>
+        <w:t>:</w:t>
+      </w:r>
+    </w:p>
+    <w:tbl>
+      <w:tblPr>
+        <w:tblW w:w="5000" w:type="pct"/>
+        <w:jc w:val="left"/>
+        <w:tblInd w:w="55" w:type="dxa"/>
+        <w:tblLayout w:type="fixed"/>
+        <w:tblCellMar>
+          <w:top w:w="55" w:type="dxa"/>
+          <w:left w:w="55" w:type="dxa"/>
+          <w:bottom w:w="55" w:type="dxa"/>
+          <w:right w:w="55" w:type="dxa"/>
+        </w:tblCellMar>
+      </w:tblPr>
+      <w:tblGrid>
+        <w:gridCol w:w="618"/>
+        <w:gridCol w:w="1411"/>
+        <w:gridCol w:w="1995"/>
+        <w:gridCol w:w="2212"/>
+        <w:gridCol w:w="1635"/>
+        <w:gridCol w:w="1484"/>
+      </w:tblGrid>
+      <w:tr>
+        <w:trPr/>
+        <w:tc>
+          <w:tcPr>
+            <w:tcW w:w="618" w:type="dxa"/>
+            <w:tcBorders>
+              <w:top w:val="single" w:sz="4" w:space="0" w:color="000000"/>
+              <w:left w:val="single" w:sz="4" w:space="0" w:color="000000"/>
+              <w:bottom w:val="single" w:sz="4" w:space="0" w:color="000000"/>
+            </w:tcBorders>
+            <w:vAlign w:val="center"/>
+          </w:tcPr>
+          <w:p>
+            <w:pPr>
+              <w:pStyle w:val="Style24"/>
+              <w:spacing w:before="0" w:after="160"/>
+              <w:jc w:val="center"/>
+              <w:rPr/>
+            </w:pPr>
+            <w:r>
+              <w:rPr/>
+              <w:t>№</w:t>
+            </w:r>
+          </w:p>
+        </w:tc>
+        <w:tc>
+          <w:tcPr>
+            <w:tcW w:w="1411" w:type="dxa"/>
+            <w:tcBorders>
+              <w:top w:val="single" w:sz="4" w:space="0" w:color="000000"/>
+              <w:left w:val="single" w:sz="4" w:space="0" w:color="000000"/>
+              <w:bottom w:val="single" w:sz="4" w:space="0" w:color="000000"/>
+            </w:tcBorders>
+            <w:vAlign w:val="center"/>
+          </w:tcPr>
+          <w:p>
+            <w:pPr>
+              <w:pStyle w:val="Style24"/>
+              <w:spacing w:before="0" w:after="160"/>
+              <w:jc w:val="center"/>
+              <w:rPr/>
+            </w:pPr>
+            <w:r>
+              <w:rPr/>
+              <w:t>Начальное состояние</w:t>
+            </w:r>
+          </w:p>
+        </w:tc>
+        <w:tc>
+          <w:tcPr>
+            <w:tcW w:w="1995" w:type="dxa"/>
+            <w:tcBorders>
+              <w:top w:val="single" w:sz="4" w:space="0" w:color="000000"/>
+              <w:left w:val="single" w:sz="4" w:space="0" w:color="000000"/>
+              <w:bottom w:val="single" w:sz="4" w:space="0" w:color="000000"/>
+            </w:tcBorders>
+            <w:vAlign w:val="center"/>
+          </w:tcPr>
+          <w:p>
+            <w:pPr>
+              <w:pStyle w:val="Style24"/>
+              <w:spacing w:before="0" w:after="160"/>
+              <w:jc w:val="center"/>
+              <w:rPr/>
+            </w:pPr>
+            <w:r>
+              <w:rPr/>
+              <w:t>Ввод</w:t>
+            </w:r>
+          </w:p>
+        </w:tc>
+        <w:tc>
+          <w:tcPr>
+            <w:tcW w:w="2212" w:type="dxa"/>
+            <w:tcBorders>
+              <w:top w:val="single" w:sz="4" w:space="0" w:color="000000"/>
+              <w:left w:val="single" w:sz="4" w:space="0" w:color="000000"/>
+              <w:bottom w:val="single" w:sz="4" w:space="0" w:color="000000"/>
+            </w:tcBorders>
+            <w:vAlign w:val="center"/>
+          </w:tcPr>
+          <w:p>
+            <w:pPr>
+              <w:pStyle w:val="Style24"/>
+              <w:spacing w:before="0" w:after="160"/>
+              <w:jc w:val="center"/>
+              <w:rPr/>
+            </w:pPr>
+            <w:r>
+              <w:rPr/>
+              <w:t>Действие системы</w:t>
+            </w:r>
+          </w:p>
+        </w:tc>
+        <w:tc>
+          <w:tcPr>
+            <w:tcW w:w="1635" w:type="dxa"/>
+            <w:tcBorders>
+              <w:top w:val="single" w:sz="4" w:space="0" w:color="000000"/>
+              <w:left w:val="single" w:sz="4" w:space="0" w:color="000000"/>
+              <w:bottom w:val="single" w:sz="4" w:space="0" w:color="000000"/>
+            </w:tcBorders>
+            <w:vAlign w:val="center"/>
+          </w:tcPr>
+          <w:p>
+            <w:pPr>
+              <w:pStyle w:val="Style24"/>
+              <w:spacing w:before="0" w:after="160"/>
+              <w:jc w:val="center"/>
+              <w:rPr/>
+            </w:pPr>
+            <w:r>
+              <w:rPr/>
+              <w:t>Вывод</w:t>
+            </w:r>
+          </w:p>
+        </w:tc>
+        <w:tc>
+          <w:tcPr>
+            <w:tcW w:w="1484" w:type="dxa"/>
+            <w:tcBorders>
+              <w:top w:val="single" w:sz="4" w:space="0" w:color="000000"/>
+              <w:left w:val="single" w:sz="4" w:space="0" w:color="000000"/>
+              <w:bottom w:val="single" w:sz="4" w:space="0" w:color="000000"/>
+              <w:right w:val="single" w:sz="4" w:space="0" w:color="000000"/>
+            </w:tcBorders>
+            <w:vAlign w:val="center"/>
+          </w:tcPr>
+          <w:p>
+            <w:pPr>
+              <w:pStyle w:val="Style24"/>
+              <w:spacing w:before="0" w:after="160"/>
+              <w:jc w:val="center"/>
+              <w:rPr/>
+            </w:pPr>
+            <w:r>
+              <w:rPr/>
+              <w:t>Конечное состояние</w:t>
+            </w:r>
+          </w:p>
+        </w:tc>
+      </w:tr>
+      <w:tr>
+        <w:trPr/>
+        <w:tc>
+          <w:tcPr>
+            <w:tcW w:w="618" w:type="dxa"/>
+            <w:tcBorders>
+              <w:left w:val="single" w:sz="4" w:space="0" w:color="000000"/>
+              <w:bottom w:val="single" w:sz="4" w:space="0" w:color="000000"/>
+            </w:tcBorders>
+            <w:vAlign w:val="center"/>
+          </w:tcPr>
+          <w:p>
+            <w:pPr>
+              <w:pStyle w:val="Style24"/>
+              <w:spacing w:before="0" w:after="160"/>
+              <w:jc w:val="center"/>
+              <w:rPr/>
+            </w:pPr>
+            <w:r>
+              <w:rPr/>
+              <w:t>1</w:t>
+            </w:r>
+          </w:p>
+        </w:tc>
+        <w:tc>
+          <w:tcPr>
+            <w:tcW w:w="1411" w:type="dxa"/>
+            <w:tcBorders>
+              <w:left w:val="single" w:sz="4" w:space="0" w:color="000000"/>
+              <w:bottom w:val="single" w:sz="4" w:space="0" w:color="000000"/>
+            </w:tcBorders>
+            <w:vAlign w:val="center"/>
+          </w:tcPr>
+          <w:p>
+            <w:pPr>
+              <w:pStyle w:val="Style24"/>
+              <w:spacing w:before="0" w:after="160"/>
+              <w:jc w:val="center"/>
+              <w:rPr/>
+            </w:pPr>
+            <w:r>
+              <w:rPr/>
+              <w:t>Готов</w:t>
+            </w:r>
+          </w:p>
+        </w:tc>
+        <w:tc>
+          <w:tcPr>
+            <w:tcW w:w="1995" w:type="dxa"/>
+            <w:tcBorders>
+              <w:left w:val="single" w:sz="4" w:space="0" w:color="000000"/>
+              <w:bottom w:val="single" w:sz="4" w:space="0" w:color="000000"/>
+            </w:tcBorders>
+            <w:vAlign w:val="center"/>
+          </w:tcPr>
+          <w:p>
+            <w:pPr>
+              <w:pStyle w:val="Style24"/>
+              <w:spacing w:before="0" w:after="160"/>
+              <w:jc w:val="center"/>
+              <w:rPr/>
+            </w:pPr>
+            <w:r>
+              <w:rPr/>
+              <w:t>Пользователь переходит на сайт</w:t>
+            </w:r>
+          </w:p>
+        </w:tc>
+        <w:tc>
+          <w:tcPr>
+            <w:tcW w:w="2212" w:type="dxa"/>
+            <w:tcBorders>
+              <w:left w:val="single" w:sz="4" w:space="0" w:color="000000"/>
+              <w:bottom w:val="single" w:sz="4" w:space="0" w:color="000000"/>
+            </w:tcBorders>
+            <w:vAlign w:val="center"/>
+          </w:tcPr>
+          <w:p>
+            <w:pPr>
+              <w:pStyle w:val="Style24"/>
+              <w:spacing w:before="0" w:after="160"/>
+              <w:jc w:val="center"/>
+              <w:rPr/>
+            </w:pPr>
+            <w:r>
+              <w:rPr/>
+              <w:t>Отображение главной страницы</w:t>
+            </w:r>
+          </w:p>
+        </w:tc>
+        <w:tc>
+          <w:tcPr>
+            <w:tcW w:w="1635" w:type="dxa"/>
+            <w:tcBorders>
+              <w:left w:val="single" w:sz="4" w:space="0" w:color="000000"/>
+              <w:bottom w:val="single" w:sz="4" w:space="0" w:color="000000"/>
+            </w:tcBorders>
+            <w:vAlign w:val="center"/>
+          </w:tcPr>
+          <w:p>
+            <w:pPr>
+              <w:pStyle w:val="Style24"/>
+              <w:spacing w:before="0" w:after="160"/>
+              <w:jc w:val="center"/>
+              <w:rPr/>
+            </w:pPr>
+            <w:r>
+              <w:rPr/>
+              <w:t>-</w:t>
+            </w:r>
+          </w:p>
+        </w:tc>
+        <w:tc>
+          <w:tcPr>
+            <w:tcW w:w="1484" w:type="dxa"/>
+            <w:tcBorders>
+              <w:left w:val="single" w:sz="4" w:space="0" w:color="000000"/>
+              <w:bottom w:val="single" w:sz="4" w:space="0" w:color="000000"/>
+              <w:right w:val="single" w:sz="4" w:space="0" w:color="000000"/>
+            </w:tcBorders>
+            <w:vAlign w:val="center"/>
+          </w:tcPr>
+          <w:p>
+            <w:pPr>
+              <w:pStyle w:val="Style24"/>
+              <w:spacing w:before="0" w:after="160"/>
+              <w:jc w:val="center"/>
+              <w:rPr/>
+            </w:pPr>
+            <w:r>
+              <w:rPr/>
+              <w:t>Готов</w:t>
+            </w:r>
+          </w:p>
+        </w:tc>
+      </w:tr>
+    </w:tbl>
+    <w:p>
+      <w:pPr>
+        <w:pStyle w:val="Normal"/>
+        <w:bidi w:val="0"/>
+        <w:spacing w:lineRule="auto" w:line="360" w:beforeAutospacing="0" w:before="0" w:afterAutospacing="0" w:after="160"/>
+        <w:ind w:firstLine="709" w:left="0" w:right="0"/>
+        <w:jc w:val="both"/>
+        <w:rPr>
+          <w:lang w:val="ru-RU"/>
+        </w:rPr>
+      </w:pPr>
+      <w:r>
+        <w:rPr/>
+      </w:r>
+    </w:p>
+    <w:p>
+      <w:pPr>
+        <w:pStyle w:val="Normal"/>
+        <w:bidi w:val="0"/>
+        <w:spacing w:lineRule="auto" w:line="360" w:beforeAutospacing="0" w:before="0" w:afterAutospacing="0" w:after="160"/>
+        <w:ind w:firstLine="709" w:left="0" w:right="0"/>
+        <w:jc w:val="both"/>
+        <w:rPr>
+          <w:lang w:val="ru-RU"/>
+        </w:rPr>
+      </w:pPr>
+      <w:r>
+        <w:rPr/>
+        <w:t>Вход в систему:</w:t>
+      </w:r>
+    </w:p>
+    <w:tbl>
+      <w:tblPr>
+        <w:tblW w:w="5000" w:type="pct"/>
+        <w:jc w:val="left"/>
+        <w:tblInd w:w="55" w:type="dxa"/>
+        <w:tblLayout w:type="fixed"/>
+        <w:tblCellMar>
+          <w:top w:w="55" w:type="dxa"/>
+          <w:left w:w="55" w:type="dxa"/>
+          <w:bottom w:w="55" w:type="dxa"/>
+          <w:right w:w="55" w:type="dxa"/>
+        </w:tblCellMar>
+      </w:tblPr>
+      <w:tblGrid>
+        <w:gridCol w:w="618"/>
+        <w:gridCol w:w="1411"/>
+        <w:gridCol w:w="1995"/>
+        <w:gridCol w:w="2212"/>
+        <w:gridCol w:w="1635"/>
+        <w:gridCol w:w="1484"/>
+      </w:tblGrid>
+      <w:tr>
+        <w:trPr/>
+        <w:tc>
+          <w:tcPr>
+            <w:tcW w:w="618" w:type="dxa"/>
+            <w:tcBorders>
+              <w:top w:val="single" w:sz="4" w:space="0" w:color="000000"/>
+              <w:left w:val="single" w:sz="4" w:space="0" w:color="000000"/>
+              <w:bottom w:val="single" w:sz="4" w:space="0" w:color="000000"/>
+            </w:tcBorders>
+            <w:vAlign w:val="center"/>
+          </w:tcPr>
+          <w:p>
+            <w:pPr>
+              <w:pStyle w:val="Style24"/>
+              <w:spacing w:before="0" w:after="160"/>
+              <w:jc w:val="center"/>
+              <w:rPr/>
+            </w:pPr>
+            <w:r>
+              <w:rPr/>
+              <w:t>№</w:t>
+            </w:r>
+          </w:p>
+        </w:tc>
+        <w:tc>
+          <w:tcPr>
+            <w:tcW w:w="1411" w:type="dxa"/>
+            <w:tcBorders>
+              <w:top w:val="single" w:sz="4" w:space="0" w:color="000000"/>
+              <w:left w:val="single" w:sz="4" w:space="0" w:color="000000"/>
+              <w:bottom w:val="single" w:sz="4" w:space="0" w:color="000000"/>
+            </w:tcBorders>
+            <w:vAlign w:val="center"/>
+          </w:tcPr>
+          <w:p>
+            <w:pPr>
+              <w:pStyle w:val="Style24"/>
+              <w:spacing w:before="0" w:after="160"/>
+              <w:jc w:val="center"/>
+              <w:rPr/>
+            </w:pPr>
+            <w:r>
+              <w:rPr/>
+              <w:t>Начальное состояние</w:t>
+            </w:r>
+          </w:p>
+        </w:tc>
+        <w:tc>
+          <w:tcPr>
+            <w:tcW w:w="1995" w:type="dxa"/>
+            <w:tcBorders>
+              <w:top w:val="single" w:sz="4" w:space="0" w:color="000000"/>
+              <w:left w:val="single" w:sz="4" w:space="0" w:color="000000"/>
+              <w:bottom w:val="single" w:sz="4" w:space="0" w:color="000000"/>
+            </w:tcBorders>
+            <w:vAlign w:val="center"/>
+          </w:tcPr>
+          <w:p>
+            <w:pPr>
+              <w:pStyle w:val="Style24"/>
+              <w:spacing w:before="0" w:after="160"/>
+              <w:jc w:val="center"/>
+              <w:rPr/>
+            </w:pPr>
+            <w:r>
+              <w:rPr/>
+              <w:t>Ввод</w:t>
+            </w:r>
+          </w:p>
+        </w:tc>
+        <w:tc>
+          <w:tcPr>
+            <w:tcW w:w="2212" w:type="dxa"/>
+            <w:tcBorders>
+              <w:top w:val="single" w:sz="4" w:space="0" w:color="000000"/>
+              <w:left w:val="single" w:sz="4" w:space="0" w:color="000000"/>
+              <w:bottom w:val="single" w:sz="4" w:space="0" w:color="000000"/>
+            </w:tcBorders>
+            <w:vAlign w:val="center"/>
+          </w:tcPr>
+          <w:p>
+            <w:pPr>
+              <w:pStyle w:val="Style24"/>
+              <w:spacing w:before="0" w:after="160"/>
+              <w:jc w:val="center"/>
+              <w:rPr/>
+            </w:pPr>
+            <w:r>
+              <w:rPr/>
+              <w:t>Действие системы</w:t>
+            </w:r>
+          </w:p>
+        </w:tc>
+        <w:tc>
+          <w:tcPr>
+            <w:tcW w:w="1635" w:type="dxa"/>
+            <w:tcBorders>
+              <w:top w:val="single" w:sz="4" w:space="0" w:color="000000"/>
+              <w:left w:val="single" w:sz="4" w:space="0" w:color="000000"/>
+              <w:bottom w:val="single" w:sz="4" w:space="0" w:color="000000"/>
+            </w:tcBorders>
+            <w:vAlign w:val="center"/>
+          </w:tcPr>
+          <w:p>
+            <w:pPr>
+              <w:pStyle w:val="Style24"/>
+              <w:spacing w:before="0" w:after="160"/>
+              <w:jc w:val="center"/>
+              <w:rPr/>
+            </w:pPr>
+            <w:r>
+              <w:rPr/>
+              <w:t>Вывод</w:t>
+            </w:r>
+          </w:p>
+        </w:tc>
+        <w:tc>
+          <w:tcPr>
+            <w:tcW w:w="1484" w:type="dxa"/>
+            <w:tcBorders>
+              <w:top w:val="single" w:sz="4" w:space="0" w:color="000000"/>
+              <w:left w:val="single" w:sz="4" w:space="0" w:color="000000"/>
+              <w:bottom w:val="single" w:sz="4" w:space="0" w:color="000000"/>
+              <w:right w:val="single" w:sz="4" w:space="0" w:color="000000"/>
+            </w:tcBorders>
+            <w:vAlign w:val="center"/>
+          </w:tcPr>
+          <w:p>
+            <w:pPr>
+              <w:pStyle w:val="Style24"/>
+              <w:spacing w:before="0" w:after="160"/>
+              <w:jc w:val="center"/>
+              <w:rPr/>
+            </w:pPr>
+            <w:r>
+              <w:rPr/>
+              <w:t>Конечное состояние</w:t>
+            </w:r>
+          </w:p>
+        </w:tc>
+      </w:tr>
+      <w:tr>
+        <w:trPr/>
+        <w:tc>
+          <w:tcPr>
+            <w:tcW w:w="618" w:type="dxa"/>
+            <w:tcBorders>
+              <w:left w:val="single" w:sz="4" w:space="0" w:color="000000"/>
+              <w:bottom w:val="single" w:sz="4" w:space="0" w:color="000000"/>
+            </w:tcBorders>
+            <w:vAlign w:val="center"/>
+          </w:tcPr>
+          <w:p>
+            <w:pPr>
+              <w:pStyle w:val="Style24"/>
+              <w:spacing w:before="0" w:after="160"/>
+              <w:jc w:val="center"/>
+              <w:rPr/>
+            </w:pPr>
+            <w:r>
+              <w:rPr/>
+              <w:t>1</w:t>
+            </w:r>
+          </w:p>
+        </w:tc>
+        <w:tc>
+          <w:tcPr>
+            <w:tcW w:w="1411" w:type="dxa"/>
+            <w:tcBorders>
+              <w:left w:val="single" w:sz="4" w:space="0" w:color="000000"/>
+              <w:bottom w:val="single" w:sz="4" w:space="0" w:color="000000"/>
+            </w:tcBorders>
+            <w:vAlign w:val="center"/>
+          </w:tcPr>
+          <w:p>
+            <w:pPr>
+              <w:pStyle w:val="Style24"/>
+              <w:spacing w:before="0" w:after="160"/>
+              <w:jc w:val="center"/>
+              <w:rPr/>
+            </w:pPr>
+            <w:r>
+              <w:rPr/>
+              <w:t>Готов</w:t>
+            </w:r>
+          </w:p>
+        </w:tc>
+        <w:tc>
+          <w:tcPr>
+            <w:tcW w:w="1995" w:type="dxa"/>
+            <w:tcBorders>
+              <w:left w:val="single" w:sz="4" w:space="0" w:color="000000"/>
+              <w:bottom w:val="single" w:sz="4" w:space="0" w:color="000000"/>
+            </w:tcBorders>
+            <w:vAlign w:val="center"/>
+          </w:tcPr>
+          <w:p>
+            <w:pPr>
+              <w:pStyle w:val="Style24"/>
+              <w:spacing w:before="0" w:after="160"/>
+              <w:jc w:val="center"/>
+              <w:rPr/>
+            </w:pPr>
+            <w:r>
+              <w:rPr/>
+              <w:t>Пользователь нажимает кнопку «Войти»</w:t>
+            </w:r>
+          </w:p>
+        </w:tc>
+        <w:tc>
+          <w:tcPr>
+            <w:tcW w:w="2212" w:type="dxa"/>
+            <w:tcBorders>
+              <w:left w:val="single" w:sz="4" w:space="0" w:color="000000"/>
+              <w:bottom w:val="single" w:sz="4" w:space="0" w:color="000000"/>
+            </w:tcBorders>
+            <w:vAlign w:val="center"/>
+          </w:tcPr>
+          <w:p>
+            <w:pPr>
+              <w:pStyle w:val="Style24"/>
+              <w:spacing w:before="0" w:after="160"/>
+              <w:jc w:val="center"/>
+              <w:rPr/>
+            </w:pPr>
+            <w:r>
+              <w:rPr/>
+              <w:t>Перенаправление на страницу авторизации</w:t>
+            </w:r>
+          </w:p>
+        </w:tc>
+        <w:tc>
+          <w:tcPr>
+            <w:tcW w:w="1635" w:type="dxa"/>
+            <w:tcBorders>
+              <w:left w:val="single" w:sz="4" w:space="0" w:color="000000"/>
+              <w:bottom w:val="single" w:sz="4" w:space="0" w:color="000000"/>
+            </w:tcBorders>
+            <w:vAlign w:val="center"/>
+          </w:tcPr>
+          <w:p>
+            <w:pPr>
+              <w:pStyle w:val="Style24"/>
+              <w:spacing w:before="0" w:after="160"/>
+              <w:jc w:val="center"/>
+              <w:rPr/>
+            </w:pPr>
+            <w:r>
+              <w:rPr/>
+              <w:t>Приглашение ввести логин и пароль</w:t>
+            </w:r>
+          </w:p>
+        </w:tc>
+        <w:tc>
+          <w:tcPr>
+            <w:tcW w:w="1484" w:type="dxa"/>
+            <w:tcBorders>
+              <w:left w:val="single" w:sz="4" w:space="0" w:color="000000"/>
+              <w:bottom w:val="single" w:sz="4" w:space="0" w:color="000000"/>
+              <w:right w:val="single" w:sz="4" w:space="0" w:color="000000"/>
+            </w:tcBorders>
+            <w:vAlign w:val="center"/>
+          </w:tcPr>
+          <w:p>
+            <w:pPr>
+              <w:pStyle w:val="Style24"/>
+              <w:spacing w:before="0" w:after="160"/>
+              <w:jc w:val="center"/>
+              <w:rPr/>
+            </w:pPr>
+            <w:r>
+              <w:rPr/>
+              <w:t>Ожидание логина и пароля</w:t>
+            </w:r>
+          </w:p>
+        </w:tc>
+      </w:tr>
+      <w:tr>
+        <w:trPr/>
+        <w:tc>
+          <w:tcPr>
+            <w:tcW w:w="618" w:type="dxa"/>
+            <w:tcBorders>
+              <w:left w:val="single" w:sz="4" w:space="0" w:color="000000"/>
+              <w:bottom w:val="single" w:sz="4" w:space="0" w:color="000000"/>
+            </w:tcBorders>
+            <w:vAlign w:val="center"/>
+          </w:tcPr>
+          <w:p>
+            <w:pPr>
+              <w:pStyle w:val="Style24"/>
+              <w:spacing w:before="0" w:after="160"/>
+              <w:jc w:val="center"/>
+              <w:rPr/>
+            </w:pPr>
+            <w:r>
+              <w:rPr/>
+              <w:t>2</w:t>
+            </w:r>
+          </w:p>
+        </w:tc>
+        <w:tc>
+          <w:tcPr>
+            <w:tcW w:w="1411" w:type="dxa"/>
+            <w:tcBorders>
+              <w:left w:val="single" w:sz="4" w:space="0" w:color="000000"/>
+              <w:bottom w:val="single" w:sz="4" w:space="0" w:color="000000"/>
+            </w:tcBorders>
+            <w:vAlign w:val="center"/>
+          </w:tcPr>
+          <w:p>
+            <w:pPr>
+              <w:pStyle w:val="Style24"/>
+              <w:spacing w:before="0" w:after="160"/>
+              <w:jc w:val="center"/>
+              <w:rPr/>
+            </w:pPr>
+            <w:r>
+              <w:rPr/>
+            </w:r>
+          </w:p>
+        </w:tc>
+        <w:tc>
+          <w:tcPr>
+            <w:tcW w:w="1995" w:type="dxa"/>
+            <w:tcBorders>
+              <w:left w:val="single" w:sz="4" w:space="0" w:color="000000"/>
+              <w:bottom w:val="single" w:sz="4" w:space="0" w:color="000000"/>
+            </w:tcBorders>
+            <w:vAlign w:val="center"/>
+          </w:tcPr>
+          <w:p>
+            <w:pPr>
+              <w:pStyle w:val="Style24"/>
+              <w:spacing w:before="0" w:after="160"/>
+              <w:jc w:val="center"/>
+              <w:rPr/>
+            </w:pPr>
+            <w:r>
+              <w:rPr/>
+            </w:r>
+          </w:p>
+        </w:tc>
+        <w:tc>
+          <w:tcPr>
+            <w:tcW w:w="2212" w:type="dxa"/>
+            <w:tcBorders>
+              <w:left w:val="single" w:sz="4" w:space="0" w:color="000000"/>
+              <w:bottom w:val="single" w:sz="4" w:space="0" w:color="000000"/>
+            </w:tcBorders>
+            <w:vAlign w:val="center"/>
+          </w:tcPr>
+          <w:p>
+            <w:pPr>
+              <w:pStyle w:val="Style24"/>
+              <w:spacing w:before="0" w:after="160"/>
+              <w:jc w:val="center"/>
+              <w:rPr/>
+            </w:pPr>
+            <w:r>
+              <w:rPr/>
+            </w:r>
+          </w:p>
+        </w:tc>
+        <w:tc>
+          <w:tcPr>
+            <w:tcW w:w="1635" w:type="dxa"/>
+            <w:tcBorders>
+              <w:left w:val="single" w:sz="4" w:space="0" w:color="000000"/>
+              <w:bottom w:val="single" w:sz="4" w:space="0" w:color="000000"/>
+            </w:tcBorders>
+            <w:vAlign w:val="center"/>
+          </w:tcPr>
+          <w:p>
+            <w:pPr>
+              <w:pStyle w:val="Style24"/>
+              <w:spacing w:before="0" w:after="160"/>
+              <w:jc w:val="center"/>
+              <w:rPr/>
+            </w:pPr>
+            <w:r>
+              <w:rPr/>
+            </w:r>
+          </w:p>
+        </w:tc>
+        <w:tc>
+          <w:tcPr>
+            <w:tcW w:w="1484" w:type="dxa"/>
+            <w:tcBorders>
+              <w:left w:val="single" w:sz="4" w:space="0" w:color="000000"/>
+              <w:bottom w:val="single" w:sz="4" w:space="0" w:color="000000"/>
+              <w:right w:val="single" w:sz="4" w:space="0" w:color="000000"/>
+            </w:tcBorders>
+            <w:vAlign w:val="center"/>
+          </w:tcPr>
+          <w:p>
+            <w:pPr>
+              <w:pStyle w:val="Style24"/>
+              <w:spacing w:before="0" w:after="160"/>
+              <w:jc w:val="center"/>
+              <w:rPr/>
+            </w:pPr>
+            <w:r>
+              <w:rPr/>
+            </w:r>
+          </w:p>
+        </w:tc>
+      </w:tr>
+      <w:tr>
+        <w:trPr/>
+        <w:tc>
+          <w:tcPr>
+            <w:tcW w:w="618" w:type="dxa"/>
+            <w:tcBorders>
+              <w:left w:val="single" w:sz="4" w:space="0" w:color="000000"/>
+              <w:bottom w:val="single" w:sz="4" w:space="0" w:color="000000"/>
+            </w:tcBorders>
+            <w:vAlign w:val="center"/>
+          </w:tcPr>
+          <w:p>
+            <w:pPr>
+              <w:pStyle w:val="Style24"/>
+              <w:spacing w:before="0" w:after="160"/>
+              <w:jc w:val="center"/>
+              <w:rPr/>
+            </w:pPr>
+            <w:r>
+              <w:rPr/>
+              <w:t>3</w:t>
+            </w:r>
+          </w:p>
+        </w:tc>
+        <w:tc>
+          <w:tcPr>
+            <w:tcW w:w="1411" w:type="dxa"/>
+            <w:tcBorders>
+              <w:left w:val="single" w:sz="4" w:space="0" w:color="000000"/>
+              <w:bottom w:val="single" w:sz="4" w:space="0" w:color="000000"/>
+            </w:tcBorders>
+            <w:vAlign w:val="center"/>
+          </w:tcPr>
+          <w:p>
+            <w:pPr>
+              <w:pStyle w:val="Style24"/>
+              <w:spacing w:before="0" w:after="160"/>
+              <w:jc w:val="center"/>
+              <w:rPr/>
+            </w:pPr>
+            <w:r>
+              <w:rPr/>
+            </w:r>
+          </w:p>
+        </w:tc>
+        <w:tc>
+          <w:tcPr>
+            <w:tcW w:w="1995" w:type="dxa"/>
+            <w:tcBorders>
+              <w:left w:val="single" w:sz="4" w:space="0" w:color="000000"/>
+              <w:bottom w:val="single" w:sz="4" w:space="0" w:color="000000"/>
+            </w:tcBorders>
+            <w:vAlign w:val="center"/>
+          </w:tcPr>
+          <w:p>
+            <w:pPr>
+              <w:pStyle w:val="Style24"/>
+              <w:spacing w:before="0" w:after="160"/>
+              <w:jc w:val="center"/>
+              <w:rPr/>
+            </w:pPr>
+            <w:r>
+              <w:rPr/>
+            </w:r>
+          </w:p>
+        </w:tc>
+        <w:tc>
+          <w:tcPr>
+            <w:tcW w:w="2212" w:type="dxa"/>
+            <w:tcBorders>
+              <w:left w:val="single" w:sz="4" w:space="0" w:color="000000"/>
+              <w:bottom w:val="single" w:sz="4" w:space="0" w:color="000000"/>
+            </w:tcBorders>
+            <w:vAlign w:val="center"/>
+          </w:tcPr>
+          <w:p>
+            <w:pPr>
+              <w:pStyle w:val="Style24"/>
+              <w:spacing w:before="0" w:after="160"/>
+              <w:jc w:val="center"/>
+              <w:rPr/>
+            </w:pPr>
+            <w:r>
+              <w:rPr/>
+            </w:r>
+          </w:p>
+        </w:tc>
+        <w:tc>
+          <w:tcPr>
+            <w:tcW w:w="1635" w:type="dxa"/>
+            <w:tcBorders>
+              <w:left w:val="single" w:sz="4" w:space="0" w:color="000000"/>
+              <w:bottom w:val="single" w:sz="4" w:space="0" w:color="000000"/>
+            </w:tcBorders>
+            <w:vAlign w:val="center"/>
+          </w:tcPr>
+          <w:p>
+            <w:pPr>
+              <w:pStyle w:val="Style24"/>
+              <w:spacing w:before="0" w:after="160"/>
+              <w:jc w:val="center"/>
+              <w:rPr/>
+            </w:pPr>
+            <w:r>
+              <w:rPr/>
+            </w:r>
+          </w:p>
+        </w:tc>
+        <w:tc>
+          <w:tcPr>
+            <w:tcW w:w="1484" w:type="dxa"/>
+            <w:tcBorders>
+              <w:left w:val="single" w:sz="4" w:space="0" w:color="000000"/>
+              <w:bottom w:val="single" w:sz="4" w:space="0" w:color="000000"/>
+              <w:right w:val="single" w:sz="4" w:space="0" w:color="000000"/>
+            </w:tcBorders>
+            <w:vAlign w:val="center"/>
+          </w:tcPr>
+          <w:p>
+            <w:pPr>
+              <w:pStyle w:val="Style24"/>
+              <w:spacing w:before="0" w:after="160"/>
+              <w:jc w:val="center"/>
+              <w:rPr/>
+            </w:pPr>
+            <w:r>
+              <w:rPr/>
+            </w:r>
+          </w:p>
+        </w:tc>
+      </w:tr>
+      <w:tr>
+        <w:trPr/>
+        <w:tc>
+          <w:tcPr>
+            <w:tcW w:w="618" w:type="dxa"/>
+            <w:tcBorders>
+              <w:left w:val="single" w:sz="4" w:space="0" w:color="000000"/>
+              <w:bottom w:val="single" w:sz="4" w:space="0" w:color="000000"/>
+            </w:tcBorders>
+            <w:vAlign w:val="center"/>
+          </w:tcPr>
+          <w:p>
+            <w:pPr>
+              <w:pStyle w:val="Style24"/>
+              <w:spacing w:before="0" w:after="160"/>
+              <w:jc w:val="center"/>
+              <w:rPr/>
+            </w:pPr>
+            <w:r>
+              <w:rPr/>
+              <w:t>4</w:t>
+            </w:r>
+          </w:p>
+        </w:tc>
+        <w:tc>
+          <w:tcPr>
+            <w:tcW w:w="1411" w:type="dxa"/>
+            <w:tcBorders>
+              <w:left w:val="single" w:sz="4" w:space="0" w:color="000000"/>
+              <w:bottom w:val="single" w:sz="4" w:space="0" w:color="000000"/>
+            </w:tcBorders>
+            <w:vAlign w:val="center"/>
+          </w:tcPr>
+          <w:p>
+            <w:pPr>
+              <w:pStyle w:val="Style24"/>
+              <w:spacing w:before="0" w:after="160"/>
+              <w:jc w:val="center"/>
+              <w:rPr/>
+            </w:pPr>
+            <w:r>
+              <w:rPr/>
+            </w:r>
+          </w:p>
+        </w:tc>
+        <w:tc>
+          <w:tcPr>
+            <w:tcW w:w="1995" w:type="dxa"/>
+            <w:tcBorders>
+              <w:left w:val="single" w:sz="4" w:space="0" w:color="000000"/>
+              <w:bottom w:val="single" w:sz="4" w:space="0" w:color="000000"/>
+            </w:tcBorders>
+            <w:vAlign w:val="center"/>
+          </w:tcPr>
+          <w:p>
+            <w:pPr>
+              <w:pStyle w:val="Style24"/>
+              <w:spacing w:before="0" w:after="160"/>
+              <w:jc w:val="center"/>
+              <w:rPr/>
+            </w:pPr>
+            <w:r>
+              <w:rPr/>
+            </w:r>
+          </w:p>
+        </w:tc>
+        <w:tc>
+          <w:tcPr>
+            <w:tcW w:w="2212" w:type="dxa"/>
+            <w:tcBorders>
+              <w:left w:val="single" w:sz="4" w:space="0" w:color="000000"/>
+              <w:bottom w:val="single" w:sz="4" w:space="0" w:color="000000"/>
+            </w:tcBorders>
+            <w:vAlign w:val="center"/>
+          </w:tcPr>
+          <w:p>
+            <w:pPr>
+              <w:pStyle w:val="Style24"/>
+              <w:spacing w:before="0" w:after="160"/>
+              <w:jc w:val="center"/>
+              <w:rPr/>
+            </w:pPr>
+            <w:r>
+              <w:rPr/>
+            </w:r>
+          </w:p>
+        </w:tc>
+        <w:tc>
+          <w:tcPr>
+            <w:tcW w:w="1635" w:type="dxa"/>
+            <w:tcBorders>
+              <w:left w:val="single" w:sz="4" w:space="0" w:color="000000"/>
+              <w:bottom w:val="single" w:sz="4" w:space="0" w:color="000000"/>
+            </w:tcBorders>
+            <w:vAlign w:val="center"/>
+          </w:tcPr>
+          <w:p>
+            <w:pPr>
+              <w:pStyle w:val="Style24"/>
+              <w:spacing w:before="0" w:after="160"/>
+              <w:jc w:val="center"/>
+              <w:rPr/>
+            </w:pPr>
+            <w:r>
+              <w:rPr/>
+            </w:r>
+          </w:p>
+        </w:tc>
+        <w:tc>
+          <w:tcPr>
+            <w:tcW w:w="1484" w:type="dxa"/>
+            <w:tcBorders>
+              <w:left w:val="single" w:sz="4" w:space="0" w:color="000000"/>
+              <w:bottom w:val="single" w:sz="4" w:space="0" w:color="000000"/>
+              <w:right w:val="single" w:sz="4" w:space="0" w:color="000000"/>
+            </w:tcBorders>
+            <w:vAlign w:val="center"/>
+          </w:tcPr>
+          <w:p>
+            <w:pPr>
+              <w:pStyle w:val="Style24"/>
+              <w:spacing w:before="0" w:after="160"/>
+              <w:jc w:val="center"/>
+              <w:rPr/>
+            </w:pPr>
+            <w:r>
+              <w:rPr/>
+            </w:r>
+          </w:p>
+        </w:tc>
+      </w:tr>
+    </w:tbl>
+    <w:p>
+      <w:pPr>
+        <w:pStyle w:val="Normal"/>
+        <w:bidi w:val="0"/>
+        <w:spacing w:lineRule="auto" w:line="360" w:beforeAutospacing="0" w:before="0" w:afterAutospacing="0" w:after="160"/>
+        <w:ind w:firstLine="709" w:left="0" w:right="0"/>
+        <w:jc w:val="both"/>
+        <w:rPr>
+          <w:lang w:val="ru-RU"/>
+        </w:rPr>
+      </w:pPr>
+      <w:r>
+        <w:rPr/>
+      </w:r>
+      <w:r>
+        <w:br w:type="page"/>
+      </w:r>
+    </w:p>
+    <w:p>
+      <w:pPr>
+        <w:pStyle w:val="Heading1"/>
+        <w:spacing w:lineRule="auto" w:line="360" w:before="0" w:after="0"/>
+        <w:ind w:left="709"/>
+        <w:jc w:val="center"/>
+        <w:rPr>
+          <w:lang w:val="ru-RU"/>
+        </w:rPr>
+      </w:pPr>
+      <w:bookmarkStart w:id="5" w:name="__RefHeading___Toc524_1614521587_Копия_3"/>
+      <w:bookmarkEnd w:id="5"/>
+      <w:r>
+        <w:rPr>
+          <w:rFonts w:eastAsia="Times New Roman" w:cs="Times New Roman"/>
+          <w:b/>
+          <w:bCs/>
+          <w:color w:val="auto"/>
+          <w:lang w:val="ru-RU"/>
+        </w:rPr>
+        <w:t>Чек-лист</w:t>
+      </w:r>
+    </w:p>
+    <w:p>
+      <w:pPr>
+        <w:pStyle w:val="Normal"/>
+        <w:bidi w:val="0"/>
+        <w:spacing w:lineRule="auto" w:line="360" w:beforeAutospacing="0" w:before="0" w:afterAutospacing="0" w:after="160"/>
+        <w:ind w:firstLine="709" w:left="0" w:right="0"/>
+        <w:jc w:val="both"/>
+        <w:rPr>
+          <w:lang w:val="ru-RU"/>
+        </w:rPr>
+      </w:pPr>
+      <w:r>
+        <w:rPr/>
+        <w:t>Текст.</w:t>
+      </w:r>
+      <w:r>
+        <w:br w:type="page"/>
+      </w:r>
+    </w:p>
+    <w:p>
+      <w:pPr>
+        <w:pStyle w:val="Heading1"/>
+        <w:spacing w:lineRule="auto" w:line="360" w:before="0" w:after="0"/>
+        <w:ind w:left="709"/>
+        <w:jc w:val="center"/>
+        <w:rPr>
+          <w:rFonts w:ascii="Times New Roman" w:hAnsi="Times New Roman"/>
+        </w:rPr>
+      </w:pPr>
+      <w:bookmarkStart w:id="6" w:name="__RefHeading___Toc524_1614521587_Копия_2"/>
+      <w:bookmarkStart w:id="7" w:name="_Toc146616696_Копия_1_Копия_1"/>
+      <w:bookmarkEnd w:id="6"/>
+      <w:r>
+        <w:rPr>
+          <w:rFonts w:eastAsia="Times New Roman" w:cs="Times New Roman"/>
+          <w:b/>
+          <w:bCs/>
+          <w:color w:val="auto"/>
         </w:rPr>
         <w:t>В</w:t>
       </w:r>
-      <w:bookmarkEnd w:id="5"/>
+      <w:bookmarkEnd w:id="7"/>
       <w:r>
         <w:rPr>
           <w:rFonts w:eastAsia="Times New Roman" w:cs="Times New Roman"/>
@@ -1482,7 +3153,7 @@
           </w:r>
           <w:r>
             <w:rPr/>
-            <w:t>8</w:t>
+            <w:t>10</w:t>
           </w:r>
           <w:r>
             <w:rPr/>
@@ -2938,7 +4609,7 @@
   </w:style>
   <w:style w:type="paragraph" w:styleId="Heading2">
     <w:name w:val="heading 2"/>
-    <w:basedOn w:val="user3"/>
+    <w:basedOn w:val="Style14"/>
     <w:next w:val="BodyText"/>
     <w:qFormat/>
     <w:pPr>
@@ -2960,7 +4631,7 @@
   </w:style>
   <w:style w:type="paragraph" w:styleId="Heading3">
     <w:name w:val="heading 3"/>
-    <w:basedOn w:val="user3"/>
+    <w:basedOn w:val="Style14"/>
     <w:next w:val="BodyText"/>
     <w:qFormat/>
     <w:pPr>
@@ -3022,20 +4693,20 @@
     <w:qFormat/>
     <w:rPr/>
   </w:style>
-  <w:style w:type="character" w:styleId="user">
-    <w:name w:val="Ссылка указателя (user)"/>
+  <w:style w:type="character" w:styleId="Style11">
+    <w:name w:val="Ссылка указателя"/>
     <w:qFormat/>
     <w:rPr/>
   </w:style>
-  <w:style w:type="character" w:styleId="user1">
-    <w:name w:val="Маркеры (user)"/>
+  <w:style w:type="character" w:styleId="Style12">
+    <w:name w:val="Маркеры"/>
     <w:qFormat/>
     <w:rPr>
       <w:rFonts w:ascii="OpenSymbol" w:hAnsi="OpenSymbol" w:eastAsia="OpenSymbol" w:cs="OpenSymbol"/>
     </w:rPr>
   </w:style>
-  <w:style w:type="character" w:styleId="user2">
-    <w:name w:val="Символ нумерации (user)"/>
+  <w:style w:type="character" w:styleId="Style13">
+    <w:name w:val="Символ нумерации"/>
     <w:qFormat/>
     <w:rPr>
       <w:rFonts w:ascii="Times New Roman" w:hAnsi="Times New Roman"/>
@@ -3060,17 +4731,17 @@
       <w:u w:val="single"/>
     </w:rPr>
   </w:style>
-  <w:style w:type="character" w:styleId="Style11">
-    <w:name w:val="Ссылка указателя"/>
+  <w:style w:type="character" w:styleId="user">
+    <w:name w:val="Ссылка указателя (user)"/>
     <w:qFormat/>
     <w:rPr/>
   </w:style>
-  <w:style w:type="character" w:styleId="Style12">
-    <w:name w:val="Символ нумерации"/>
+  <w:style w:type="character" w:styleId="user1">
+    <w:name w:val="Символ нумерации (user)"/>
     <w:qFormat/>
     <w:rPr/>
   </w:style>
-  <w:style w:type="paragraph" w:styleId="Style13">
+  <w:style w:type="paragraph" w:styleId="Style14">
     <w:name w:val="Заголовок"/>
     <w:basedOn w:val="Normal"/>
     <w:next w:val="BodyText"/>
@@ -3121,7 +4792,7 @@
       <w:szCs w:val="24"/>
     </w:rPr>
   </w:style>
-  <w:style w:type="paragraph" w:styleId="Style14">
+  <w:style w:type="paragraph" w:styleId="Style15">
     <w:name w:val="Указатель"/>
     <w:basedOn w:val="Normal"/>
     <w:qFormat/>
@@ -3132,7 +4803,7 @@
       <w:rFonts w:cs="Arial"/>
     </w:rPr>
   </w:style>
-  <w:style w:type="paragraph" w:styleId="user3">
+  <w:style w:type="paragraph" w:styleId="user2">
     <w:name w:val="Заголовок (user)"/>
     <w:basedOn w:val="Normal"/>
     <w:next w:val="BodyText"/>
@@ -3147,7 +4818,7 @@
       <w:szCs w:val="28"/>
     </w:rPr>
   </w:style>
-  <w:style w:type="paragraph" w:styleId="user4">
+  <w:style w:type="paragraph" w:styleId="user3">
     <w:name w:val="Указатель (user)"/>
     <w:basedOn w:val="Normal"/>
     <w:qFormat/>
@@ -3170,22 +4841,22 @@
     </w:pPr>
     <w:rPr/>
   </w:style>
-  <w:style w:type="paragraph" w:styleId="Style15">
+  <w:style w:type="paragraph" w:styleId="Style16">
     <w:name w:val="Колонтитул"/>
     <w:basedOn w:val="Normal"/>
     <w:qFormat/>
     <w:pPr/>
     <w:rPr/>
   </w:style>
-  <w:style w:type="paragraph" w:styleId="Style16">
-    <w:name w:val="Колонтитулы"/>
+  <w:style w:type="paragraph" w:styleId="user4">
+    <w:name w:val="Колонтитулы (user)"/>
     <w:basedOn w:val="Normal"/>
     <w:qFormat/>
     <w:pPr/>
     <w:rPr/>
   </w:style>
-  <w:style w:type="paragraph" w:styleId="user5">
-    <w:name w:val="Колонтитулы (user)"/>
+  <w:style w:type="paragraph" w:styleId="Style17">
+    <w:name w:val="Колонтитулы"/>
     <w:basedOn w:val="Normal"/>
     <w:qFormat/>
     <w:pPr/>
@@ -3237,7 +4908,7 @@
   </w:style>
   <w:style w:type="paragraph" w:styleId="IndexHeading">
     <w:name w:val="index heading"/>
-    <w:basedOn w:val="user3"/>
+    <w:basedOn w:val="Style14"/>
     <w:pPr/>
     <w:rPr/>
   </w:style>
@@ -3260,7 +4931,7 @@
   </w:style>
   <w:style w:type="paragraph" w:styleId="Title">
     <w:name w:val="Title"/>
-    <w:basedOn w:val="user3"/>
+    <w:basedOn w:val="Style14"/>
     <w:next w:val="BodyText"/>
     <w:qFormat/>
     <w:pPr>
@@ -3273,8 +4944,8 @@
       <w:szCs w:val="56"/>
     </w:rPr>
   </w:style>
-  <w:style w:type="paragraph" w:styleId="user6">
-    <w:name w:val="Рисунок (user)"/>
+  <w:style w:type="paragraph" w:styleId="Style18">
+    <w:name w:val="Рисунок"/>
     <w:basedOn w:val="Caption"/>
     <w:qFormat/>
     <w:pPr/>
@@ -3285,26 +4956,42 @@
       <w:szCs w:val="28"/>
     </w:rPr>
   </w:style>
-  <w:style w:type="paragraph" w:styleId="user7">
-    <w:name w:val="Содержимое врезки (user)"/>
+  <w:style w:type="paragraph" w:styleId="Style19">
+    <w:name w:val="Содержимое врезки"/>
     <w:basedOn w:val="Normal"/>
     <w:qFormat/>
     <w:pPr/>
     <w:rPr/>
   </w:style>
-  <w:style w:type="paragraph" w:styleId="user8">
-    <w:name w:val="Содержимое таблицы (user)"/>
+  <w:style w:type="paragraph" w:styleId="Style20">
+    <w:name w:val="Содержимое таблицы"/>
     <w:basedOn w:val="Normal"/>
     <w:qFormat/>
     <w:pPr>
       <w:widowControl w:val="false"/>
       <w:suppressLineNumbers/>
+      <w:jc w:val="left"/>
     </w:pPr>
-    <w:rPr/>
+    <w:rPr>
+      <w:rFonts w:ascii="Times New Roman" w:hAnsi="Times New Roman"/>
+      <w:b w:val="false"/>
+      <w:bCs w:val="false"/>
+      <w:i w:val="false"/>
+      <w:iCs w:val="false"/>
+      <w:strike w:val="false"/>
+      <w:dstrike w:val="false"/>
+      <w:outline w:val="false"/>
+      <w:shadow w:val="false"/>
+      <w:color w:val="000000"/>
+      <w:sz w:val="28"/>
+      <w:szCs w:val="28"/>
+      <w:u w:val="none"/>
+      <w:lang w:val="ru-RU"/>
+    </w:rPr>
   </w:style>
-  <w:style w:type="paragraph" w:styleId="user9">
-    <w:name w:val="Заголовок таблицы (user)"/>
-    <w:basedOn w:val="user8"/>
+  <w:style w:type="paragraph" w:styleId="Style21">
+    <w:name w:val="Заголовок таблицы"/>
+    <w:basedOn w:val="Style20"/>
     <w:qFormat/>
     <w:pPr>
       <w:suppressLineNumbers/>
@@ -3315,14 +5002,14 @@
       <w:bCs/>
     </w:rPr>
   </w:style>
-  <w:style w:type="paragraph" w:styleId="user10">
-    <w:name w:val="Фигура (user)"/>
+  <w:style w:type="paragraph" w:styleId="Style22">
+    <w:name w:val="Фигура"/>
     <w:basedOn w:val="Caption"/>
     <w:qFormat/>
     <w:pPr/>
     <w:rPr/>
   </w:style>
-  <w:style w:type="paragraph" w:styleId="Style17">
+  <w:style w:type="paragraph" w:styleId="Style23">
     <w:name w:val="График"/>
     <w:basedOn w:val="Caption"/>
     <w:qFormat/>
@@ -3331,7 +5018,7 @@
   </w:style>
   <w:style w:type="paragraph" w:styleId="TOC2">
     <w:name w:val="toc 2"/>
-    <w:basedOn w:val="user4"/>
+    <w:basedOn w:val="Style15"/>
     <w:pPr>
       <w:tabs>
         <w:tab w:val="clear" w:pos="708"/>
@@ -3343,7 +5030,7 @@
   </w:style>
   <w:style w:type="paragraph" w:styleId="TOC3">
     <w:name w:val="toc 3"/>
-    <w:basedOn w:val="user4"/>
+    <w:basedOn w:val="Style15"/>
     <w:pPr>
       <w:tabs>
         <w:tab w:val="clear" w:pos="708"/>
@@ -3353,15 +5040,22 @@
     </w:pPr>
     <w:rPr/>
   </w:style>
-  <w:style w:type="paragraph" w:styleId="Style18">
-    <w:name w:val="Содержимое врезки"/>
+  <w:style w:type="paragraph" w:styleId="user5">
+    <w:name w:val="Содержимое врезки (user)"/>
     <w:basedOn w:val="Normal"/>
     <w:qFormat/>
     <w:pPr/>
     <w:rPr/>
   </w:style>
-  <w:style w:type="numbering" w:styleId="Style19" w:default="1">
-    <w:name w:val="Без списка"/>
+  <w:style w:type="paragraph" w:styleId="Style24">
+    <w:name w:val="Текст в Таблице"/>
+    <w:basedOn w:val="Style20"/>
+    <w:qFormat/>
+    <w:pPr/>
+    <w:rPr/>
+  </w:style>
+  <w:style w:type="numbering" w:styleId="user6" w:default="1">
+    <w:name w:val="Без списка (user)"/>
     <w:uiPriority w:val="99"/>
     <w:semiHidden/>
     <w:unhideWhenUsed/>

</xml_diff>